<commit_message>
Lung T-cell report: add 'Page N of M' footer
make_docx.py adds PAGE / NUMPAGES fields, bottom centre, per the office
rule that every report PDF carries page numbers. Rebuilt report.docx,
report.pdf and the editable docx; text unchanged (99/99 paragraphs
verbatim, 22 pages, 0 slide overflow). slides.pdf kept (slides.pptx
unchanged). SHA256SUMS regenerated.

Co-Authored-By: Claude Opus 5.5 <noreply@anthropic.com>
</commit_message>
<xml_diff>
--- a/2026-09-lung-tcell-imrad/report.docx
+++ b/2026-09-lung-tcell-imrad/report.docx
@@ -522,7 +522,7 @@
                     <pic:cNvPicPr/>
                   </pic:nvPicPr>
                   <pic:blipFill>
-                    <a:blip r:embed="rId9"/>
+                    <a:blip r:embed="rId10"/>
                     <a:stretch>
                       <a:fillRect/>
                     </a:stretch>
@@ -942,7 +942,7 @@
                     <pic:cNvPicPr/>
                   </pic:nvPicPr>
                   <pic:blipFill>
-                    <a:blip r:embed="rId10"/>
+                    <a:blip r:embed="rId11"/>
                     <a:stretch>
                       <a:fillRect/>
                     </a:stretch>
@@ -1294,7 +1294,7 @@
                     <pic:cNvPicPr/>
                   </pic:nvPicPr>
                   <pic:blipFill>
-                    <a:blip r:embed="rId11"/>
+                    <a:blip r:embed="rId12"/>
                     <a:stretch>
                       <a:fillRect/>
                     </a:stretch>
@@ -1413,7 +1413,7 @@
                     <pic:cNvPicPr/>
                   </pic:nvPicPr>
                   <pic:blipFill>
-                    <a:blip r:embed="rId12"/>
+                    <a:blip r:embed="rId13"/>
                     <a:stretch>
                       <a:fillRect/>
                     </a:stretch>
@@ -1475,7 +1475,7 @@
                     <pic:cNvPicPr/>
                   </pic:nvPicPr>
                   <pic:blipFill>
-                    <a:blip r:embed="rId13"/>
+                    <a:blip r:embed="rId14"/>
                     <a:stretch>
                       <a:fillRect/>
                     </a:stretch>
@@ -1624,7 +1624,7 @@
                     <pic:cNvPicPr/>
                   </pic:nvPicPr>
                   <pic:blipFill>
-                    <a:blip r:embed="rId14"/>
+                    <a:blip r:embed="rId15"/>
                     <a:stretch>
                       <a:fillRect/>
                     </a:stretch>
@@ -1765,7 +1765,7 @@
                     <pic:cNvPicPr/>
                   </pic:nvPicPr>
                   <pic:blipFill>
-                    <a:blip r:embed="rId15"/>
+                    <a:blip r:embed="rId16"/>
                     <a:stretch>
                       <a:fillRect/>
                     </a:stretch>
@@ -1897,7 +1897,7 @@
                     <pic:cNvPicPr/>
                   </pic:nvPicPr>
                   <pic:blipFill>
-                    <a:blip r:embed="rId16"/>
+                    <a:blip r:embed="rId17"/>
                     <a:stretch>
                       <a:fillRect/>
                     </a:stretch>
@@ -2978,7 +2978,7 @@
                     <pic:cNvPicPr/>
                   </pic:nvPicPr>
                   <pic:blipFill>
-                    <a:blip r:embed="rId17"/>
+                    <a:blip r:embed="rId18"/>
                     <a:stretch>
                       <a:fillRect/>
                     </a:stretch>
@@ -3087,7 +3087,7 @@
                     <pic:cNvPicPr/>
                   </pic:nvPicPr>
                   <pic:blipFill>
-                    <a:blip r:embed="rId18"/>
+                    <a:blip r:embed="rId19"/>
                     <a:stretch>
                       <a:fillRect/>
                     </a:stretch>
@@ -6805,6 +6805,7 @@
       </w:tr>
     </w:tbl>
     <w:sectPr>
+      <w:footerReference w:type="default" r:id="rId9"/>
       <w:pgSz w:w="11906" w:h="16838"/>
       <w:pgMar w:top="1247" w:right="1247" w:bottom="1247" w:left="1247" w:header="720" w:footer="720" w:gutter="0"/>
       <w:cols w:space="720"/>
@@ -6812,6 +6813,53 @@
     </w:sectPr>
   </w:body>
 </w:document>
+</file>
+
+<file path=word/footer1.xml><?xml version="1.0" encoding="utf-8"?>
+<w:ftr xmlns:m="http://schemas.openxmlformats.org/officeDocument/2006/math" xmlns:mc="http://schemas.openxmlformats.org/markup-compatibility/2006" xmlns:mo="http://schemas.microsoft.com/office/mac/office/2008/main" xmlns:mv="urn:schemas-microsoft-com:mac:vml" xmlns:o="urn:schemas-microsoft-com:office:office" xmlns:r="http://schemas.openxmlformats.org/officeDocument/2006/relationships" xmlns:v="urn:schemas-microsoft-com:vml" xmlns:w10="urn:schemas-microsoft-com:office:word" xmlns:w14="http://schemas.microsoft.com/office/word/2010/wordml" xmlns:w="http://schemas.openxmlformats.org/wordprocessingml/2006/main" xmlns:wne="http://schemas.microsoft.com/office/word/2006/wordml" xmlns:wp14="http://schemas.microsoft.com/office/word/2010/wordprocessingDrawing" xmlns:wp="http://schemas.openxmlformats.org/drawingml/2006/wordprocessingDrawing" xmlns:wpc="http://schemas.microsoft.com/office/word/2010/wordprocessingCanvas" xmlns:wpg="http://schemas.microsoft.com/office/word/2010/wordprocessingGroup" xmlns:wpi="http://schemas.microsoft.com/office/word/2010/wordprocessingInk" xmlns:wps="http://schemas.microsoft.com/office/word/2010/wordprocessingShape" mc:Ignorable="w14 wp14">
+  <w:p>
+    <w:pPr>
+      <w:pStyle w:val="Footer"/>
+      <w:jc w:val="center"/>
+    </w:pPr>
+    <w:r>
+      <w:t xml:space="preserve">Page </w:t>
+    </w:r>
+    <w:r>
+      <w:fldChar w:fldCharType="begin" w:dirty="true"/>
+    </w:r>
+    <w:r>
+      <w:instrText xml:space="preserve"> PAGE </w:instrText>
+    </w:r>
+    <w:r>
+      <w:fldChar w:fldCharType="separate"/>
+    </w:r>
+    <w:r>
+      <w:t>1</w:t>
+    </w:r>
+    <w:r>
+      <w:fldChar w:fldCharType="end"/>
+    </w:r>
+    <w:r>
+      <w:t xml:space="preserve"> of </w:t>
+    </w:r>
+    <w:r>
+      <w:fldChar w:fldCharType="begin" w:dirty="true"/>
+    </w:r>
+    <w:r>
+      <w:instrText xml:space="preserve"> NUMPAGES </w:instrText>
+    </w:r>
+    <w:r>
+      <w:fldChar w:fldCharType="separate"/>
+    </w:r>
+    <w:r>
+      <w:t>1</w:t>
+    </w:r>
+    <w:r>
+      <w:fldChar w:fldCharType="end"/>
+    </w:r>
+  </w:p>
+</w:ftr>
 </file>
 
 <file path=word/numbering.xml><?xml version="1.0" encoding="utf-8"?>

</xml_diff>